<commit_message>
Reconcile Status Report schedule-variance wording
Fixes the "~40% elapsed, behind plan" phrasing, which conflated
calendar elapsed time (neutral) with earned-value variance (the
behind-plan measure). Corrected to:
- "~Month 10 of 24 (40% elapsed); earned ~40% vs ~50% planned, so
  ~10% behind plan on heavy/critical activities (SV -10%, SPI ~0.80)"
Applies the same reconciliation to the Overview card and the Document
10 DOCX. Validators green (static 341, browser 181).

Co-authored-by: CommandCodeBot <noreply@commandcode.ai>
</commit_message>
<xml_diff>
--- a/10 - Pole Trust Bank - Project Health and Status Report.docx
+++ b/10 - Pole Trust Bank - Project Health and Status Report.docx
@@ -37,7 +37,7 @@
           <w:color w:val="555555"/>
           <w:sz w:val="22"/>
         </w:rPr>
-        <w:t>One-page status the leaders actually read: red, amber or green against the approved schedule and budget baseline, with the variance in numbers — not adjectives. Progress is 40%; the programme is lagging ~10% on the critical path and ~12% over the planned phase budget.</w:t>
+        <w:t>One-page status the leaders actually read: red, amber or green against the approved schedule and budget baseline, with the variance in numbers — not adjectives. The programme is ~Month 10 of 24 (40% elapsed); earned progress of 40% is ~10% behind the ~50% planned, and the phase budget is ~12% over plan.</w:t>
       </w:r>
     </w:p>
     <w:tbl>
@@ -167,7 +167,7 @@
                 <w:b w:val="0"/>
                 <w:sz w:val="19"/>
               </w:rPr>
-              <w:t>40% overall vs 24-month roadmap (≈ month 9–10)</w:t>
+              <w:t>40% complete against the 24-month roadmap</w:t>
             </w:r>
           </w:p>
         </w:tc>
@@ -207,7 +207,7 @@
                 <w:b w:val="0"/>
                 <w:sz w:val="19"/>
               </w:rPr>
-              <w:t>~10% behind plan on critical path / heavy activities (SV −10%, SPI ≈ 0.80)</w:t>
+              <w:t>EV 40% vs PV ≈ 50% ⇒ SV −10%; SPI ≈ 0.80 (critical path / heavy activities)</w:t>
             </w:r>
           </w:p>
         </w:tc>
@@ -318,7 +318,7 @@
           <w:color w:val="555555"/>
           <w:sz w:val="22"/>
         </w:rPr>
-        <w:t>Scope: 7 controlled deliverables (D1–D7) / 48 work packages. Schedule: 24-month critical path, ~40% elapsed, behind on heavy activities. Budget: approved USD 11.5M CAPEX / 27.5M TCO envelope; phase actual ~12% over plan. USD 0 released until DEC-02.</w:t>
+        <w:t>Scope: 7 controlled deliverables (D1–D7) / 48 work packages. Schedule: ~Month 10 of 24 (40% elapsed); earned ~40% is ~10% behind the ~50% planned, concentrated on heavy/critical-path activities. Budget: approved USD 11.5M CAPEX / 27.5M TCO envelope; phase actual ~12% over plan. USD 0 released until DEC-02.</w:t>
       </w:r>
     </w:p>
     <w:p>
@@ -975,7 +975,7 @@
           <w:color w:val="555555"/>
           <w:sz w:val="22"/>
         </w:rPr>
-        <w:t>Relation of variance: the ~12% cost variance tracks the ~10% schedule delay — heavy/critical-path work is costing more than planned. Reported in numbers (CV −12%, CPI ≈ 0.89), governed by the approved envelope, routed to the Sponsor (DEC-02/DEC-03), never absorbed silently.</w:t>
+        <w:t>Relation of variance: the ~12% cost variance tracks the ~10% schedule lag — heavy/critical-path work is costing more than planned. Reported in numbers (CV −12%, CPI ≈ 0.89), governed by the approved envelope, routed to the Sponsor (DEC-02/DEC-03), never absorbed silently.</w:t>
       </w:r>
     </w:p>
     <w:tbl>

</xml_diff>

<commit_message>
Fix RAG status colour coding in Status Report and change-control artefacts
- HTML: the "RED" status badges were using the green/success className
  (badge go); corrected to the proper red class (badge red) across the
  Status Report's progress/cost/schedule tables and exec-summary grid
  (10 occurrences). AMBER and OK were already correct.
- DOCX 10 (Key Insights): status values (OK/RED/AMBER) are now colour
  coded - OK green, RED red text, AMBER amber - matching the HTML.
- DOCX 11 (Key Insights): the change decision column (Approved/Rejected/
  Deferred) is colour coded - Approved green, Rejected red, Deferred amber.
- Validators green.

Co-authored-by: CommandCodeBot <noreply@commandcode.ai>
</commit_message>
<xml_diff>
--- a/10 - Pole Trust Bank - Project Health and Status Report.docx
+++ b/10 - Pole Trust Bank - Project Health and Status Report.docx
@@ -563,7 +563,8 @@
             <w:r>
               <w:rPr>
                 <w:rFonts w:ascii="Calibri" w:hAnsi="Calibri"/>
-                <w:b w:val="0"/>
+                <w:b/>
+                <w:color w:val="1E7A4F"/>
                 <w:sz w:val="19"/>
               </w:rPr>
               <w:t>OK</w:t>
@@ -660,7 +661,8 @@
             <w:r>
               <w:rPr>
                 <w:rFonts w:ascii="Calibri" w:hAnsi="Calibri"/>
-                <w:b w:val="0"/>
+                <w:b/>
+                <w:color w:val="1E7A4F"/>
                 <w:sz w:val="19"/>
               </w:rPr>
               <w:t>OK</w:t>
@@ -752,7 +754,8 @@
             <w:r>
               <w:rPr>
                 <w:rFonts w:ascii="Calibri" w:hAnsi="Calibri"/>
-                <w:b w:val="0"/>
+                <w:b/>
+                <w:color w:val="C0392B"/>
                 <w:sz w:val="19"/>
               </w:rPr>
               <w:t>RED</w:t>
@@ -849,7 +852,8 @@
             <w:r>
               <w:rPr>
                 <w:rFonts w:ascii="Calibri" w:hAnsi="Calibri"/>
-                <w:b w:val="0"/>
+                <w:b/>
+                <w:color w:val="C0392B"/>
                 <w:sz w:val="19"/>
               </w:rPr>
               <w:t>RED</w:t>
@@ -941,10 +945,491 @@
             <w:r>
               <w:rPr>
                 <w:rFonts w:ascii="Calibri" w:hAnsi="Calibri"/>
+                <w:b/>
+                <w:color w:val="B8860B"/>
+                <w:sz w:val="19"/>
+              </w:rPr>
+              <w:t>AMBER</w:t>
+            </w:r>
+          </w:p>
+        </w:tc>
+      </w:tr>
+    </w:tbl>
+    <w:tbl>
+      <w:tblPr>
+        <w:tblStyle w:val="TableGrid"/>
+        <w:tblW w:type="auto" w:w="0"/>
+        <w:jc w:val="center"/>
+        <w:tblLayout w:type="fixed"/>
+        <w:tblLook w:firstColumn="1" w:firstRow="1" w:lastColumn="0" w:lastRow="0" w:noHBand="0" w:noVBand="1" w:val="04A0"/>
+      </w:tblPr>
+      <w:tblGrid>
+        <w:gridCol w:w="3849"/>
+        <w:gridCol w:w="3849"/>
+        <w:gridCol w:w="3849"/>
+        <w:gridCol w:w="3849"/>
+      </w:tblGrid>
+      <w:tr>
+        <w:tc>
+          <w:tcPr>
+            <w:tcW w:type="dxa" w:w="3402"/>
+            <w:shd w:val="clear" w:color="auto" w:fill="0F2A4A"/>
+          </w:tcPr>
+          <w:p>
+            <w:pPr>
+              <w:spacing w:before="10" w:after="10"/>
+            </w:pPr>
+            <w:r>
+              <w:rPr>
+                <w:rFonts w:ascii="Calibri" w:hAnsi="Calibri"/>
+                <w:b/>
+                <w:color w:val="FFFFFF"/>
+                <w:sz w:val="19"/>
+              </w:rPr>
+              <w:t>Measure</w:t>
+            </w:r>
+          </w:p>
+        </w:tc>
+        <w:tc>
+          <w:tcPr>
+            <w:tcW w:type="dxa" w:w="2608"/>
+            <w:shd w:val="clear" w:color="auto" w:fill="0F2A4A"/>
+          </w:tcPr>
+          <w:p>
+            <w:pPr>
+              <w:spacing w:before="10" w:after="10"/>
+            </w:pPr>
+            <w:r>
+              <w:rPr>
+                <w:rFonts w:ascii="Calibri" w:hAnsi="Calibri"/>
+                <w:b/>
+                <w:color w:val="FFFFFF"/>
+                <w:sz w:val="19"/>
+              </w:rPr>
+              <w:t>Value</w:t>
+            </w:r>
+          </w:p>
+        </w:tc>
+        <w:tc>
+          <w:tcPr>
+            <w:tcW w:type="dxa" w:w="4536"/>
+            <w:shd w:val="clear" w:color="auto" w:fill="0F2A4A"/>
+          </w:tcPr>
+          <w:p>
+            <w:pPr>
+              <w:spacing w:before="10" w:after="10"/>
+            </w:pPr>
+            <w:r>
+              <w:rPr>
+                <w:rFonts w:ascii="Calibri" w:hAnsi="Calibri"/>
+                <w:b/>
+                <w:color w:val="FFFFFF"/>
+                <w:sz w:val="19"/>
+              </w:rPr>
+              <w:t>Variance (numbers)</w:t>
+            </w:r>
+          </w:p>
+        </w:tc>
+        <w:tc>
+          <w:tcPr>
+            <w:tcW w:type="dxa" w:w="3061"/>
+            <w:shd w:val="clear" w:color="auto" w:fill="0F2A4A"/>
+          </w:tcPr>
+          <w:p>
+            <w:pPr>
+              <w:spacing w:before="10" w:after="10"/>
+            </w:pPr>
+            <w:r>
+              <w:rPr>
+                <w:rFonts w:ascii="Calibri" w:hAnsi="Calibri"/>
+                <w:b/>
+                <w:color w:val="FFFFFF"/>
+                <w:sz w:val="19"/>
+              </w:rPr>
+              <w:t>Status</w:t>
+            </w:r>
+          </w:p>
+        </w:tc>
+      </w:tr>
+      <w:tr>
+        <w:tc>
+          <w:tcPr>
+            <w:tcW w:type="dxa" w:w="3402"/>
+          </w:tcPr>
+          <w:p>
+            <w:pPr>
+              <w:spacing w:before="10" w:after="10"/>
+            </w:pPr>
+            <w:r>
+              <w:rPr>
+                <w:rFonts w:ascii="Calibri" w:hAnsi="Calibri"/>
                 <w:b w:val="0"/>
                 <w:sz w:val="19"/>
               </w:rPr>
-              <w:t>AMBER</w:t>
+              <w:t>Elapsed</w:t>
+            </w:r>
+          </w:p>
+        </w:tc>
+        <w:tc>
+          <w:tcPr>
+            <w:tcW w:type="dxa" w:w="2608"/>
+          </w:tcPr>
+          <w:p>
+            <w:pPr>
+              <w:spacing w:before="10" w:after="10"/>
+            </w:pPr>
+            <w:r>
+              <w:rPr>
+                <w:rFonts w:ascii="Calibri" w:hAnsi="Calibri"/>
+                <w:b w:val="0"/>
+                <w:sz w:val="19"/>
+              </w:rPr>
+              <w:t>≈ Month 10 (40%)</w:t>
+            </w:r>
+          </w:p>
+        </w:tc>
+        <w:tc>
+          <w:tcPr>
+            <w:tcW w:type="dxa" w:w="4536"/>
+          </w:tcPr>
+          <w:p>
+            <w:pPr>
+              <w:spacing w:before="10" w:after="10"/>
+            </w:pPr>
+            <w:r>
+              <w:rPr>
+                <w:rFonts w:ascii="Calibri" w:hAnsi="Calibri"/>
+                <w:b w:val="0"/>
+                <w:sz w:val="19"/>
+              </w:rPr>
+              <w:t>40% elapsed vs 24-month</w:t>
+            </w:r>
+          </w:p>
+        </w:tc>
+        <w:tc>
+          <w:tcPr>
+            <w:tcW w:type="dxa" w:w="3061"/>
+          </w:tcPr>
+          <w:p>
+            <w:pPr>
+              <w:spacing w:before="10" w:after="10"/>
+            </w:pPr>
+            <w:r>
+              <w:rPr>
+                <w:rFonts w:ascii="Calibri" w:hAnsi="Calibri"/>
+                <w:b/>
+                <w:color w:val="1E7A4F"/>
+                <w:sz w:val="19"/>
+              </w:rPr>
+              <w:t>OK</w:t>
+            </w:r>
+          </w:p>
+        </w:tc>
+      </w:tr>
+      <w:tr>
+        <w:tc>
+          <w:tcPr>
+            <w:tcW w:type="dxa" w:w="3402"/>
+            <w:shd w:val="clear" w:color="auto" w:fill="F4F7FA"/>
+          </w:tcPr>
+          <w:p>
+            <w:pPr>
+              <w:spacing w:before="10" w:after="10"/>
+            </w:pPr>
+            <w:r>
+              <w:rPr>
+                <w:rFonts w:ascii="Calibri" w:hAnsi="Calibri"/>
+                <w:b w:val="0"/>
+                <w:sz w:val="19"/>
+              </w:rPr>
+              <w:t>Planned Value (PV)</w:t>
+            </w:r>
+          </w:p>
+        </w:tc>
+        <w:tc>
+          <w:tcPr>
+            <w:tcW w:type="dxa" w:w="2608"/>
+            <w:shd w:val="clear" w:color="auto" w:fill="F4F7FA"/>
+          </w:tcPr>
+          <w:p>
+            <w:pPr>
+              <w:spacing w:before="10" w:after="10"/>
+            </w:pPr>
+            <w:r>
+              <w:rPr>
+                <w:rFonts w:ascii="Calibri" w:hAnsi="Calibri"/>
+                <w:b w:val="0"/>
+                <w:sz w:val="19"/>
+              </w:rPr>
+              <w:t>≈ 50% by Month 10</w:t>
+            </w:r>
+          </w:p>
+        </w:tc>
+        <w:tc>
+          <w:tcPr>
+            <w:tcW w:type="dxa" w:w="4536"/>
+            <w:shd w:val="clear" w:color="auto" w:fill="F4F7FA"/>
+          </w:tcPr>
+          <w:p>
+            <w:pPr>
+              <w:spacing w:before="10" w:after="10"/>
+            </w:pPr>
+            <w:r>
+              <w:rPr>
+                <w:rFonts w:ascii="Calibri" w:hAnsi="Calibri"/>
+                <w:b w:val="0"/>
+                <w:sz w:val="19"/>
+              </w:rPr>
+              <w:t>front-loaded critical-path baseline</w:t>
+            </w:r>
+          </w:p>
+        </w:tc>
+        <w:tc>
+          <w:tcPr>
+            <w:tcW w:type="dxa" w:w="3061"/>
+            <w:shd w:val="clear" w:color="auto" w:fill="F4F7FA"/>
+          </w:tcPr>
+          <w:p>
+            <w:pPr>
+              <w:spacing w:before="10" w:after="10"/>
+            </w:pPr>
+            <w:r>
+              <w:rPr>
+                <w:rFonts w:ascii="Calibri" w:hAnsi="Calibri"/>
+                <w:b/>
+                <w:color w:val="1E7A4F"/>
+                <w:sz w:val="19"/>
+              </w:rPr>
+              <w:t>OK</w:t>
+            </w:r>
+          </w:p>
+        </w:tc>
+      </w:tr>
+      <w:tr>
+        <w:tc>
+          <w:tcPr>
+            <w:tcW w:type="dxa" w:w="3402"/>
+          </w:tcPr>
+          <w:p>
+            <w:pPr>
+              <w:spacing w:before="10" w:after="10"/>
+            </w:pPr>
+            <w:r>
+              <w:rPr>
+                <w:rFonts w:ascii="Calibri" w:hAnsi="Calibri"/>
+                <w:b w:val="0"/>
+                <w:sz w:val="19"/>
+              </w:rPr>
+              <w:t>Earned Value (EV)</w:t>
+            </w:r>
+          </w:p>
+        </w:tc>
+        <w:tc>
+          <w:tcPr>
+            <w:tcW w:type="dxa" w:w="2608"/>
+          </w:tcPr>
+          <w:p>
+            <w:pPr>
+              <w:spacing w:before="10" w:after="10"/>
+            </w:pPr>
+            <w:r>
+              <w:rPr>
+                <w:rFonts w:ascii="Calibri" w:hAnsi="Calibri"/>
+                <w:b w:val="0"/>
+                <w:sz w:val="19"/>
+              </w:rPr>
+              <w:t>40% complete</w:t>
+            </w:r>
+          </w:p>
+        </w:tc>
+        <w:tc>
+          <w:tcPr>
+            <w:tcW w:type="dxa" w:w="4536"/>
+          </w:tcPr>
+          <w:p>
+            <w:pPr>
+              <w:spacing w:before="10" w:after="10"/>
+            </w:pPr>
+            <w:r>
+              <w:rPr>
+                <w:rFonts w:ascii="Calibri" w:hAnsi="Calibri"/>
+                <w:b w:val="0"/>
+                <w:sz w:val="19"/>
+              </w:rPr>
+              <w:t>SV = −10% (behind plan)</w:t>
+            </w:r>
+          </w:p>
+        </w:tc>
+        <w:tc>
+          <w:tcPr>
+            <w:tcW w:type="dxa" w:w="3061"/>
+          </w:tcPr>
+          <w:p>
+            <w:pPr>
+              <w:spacing w:before="10" w:after="10"/>
+            </w:pPr>
+            <w:r>
+              <w:rPr>
+                <w:rFonts w:ascii="Calibri" w:hAnsi="Calibri"/>
+                <w:b/>
+                <w:color w:val="C0392B"/>
+                <w:sz w:val="19"/>
+              </w:rPr>
+              <w:t>RED</w:t>
+            </w:r>
+          </w:p>
+        </w:tc>
+      </w:tr>
+      <w:tr>
+        <w:tc>
+          <w:tcPr>
+            <w:tcW w:type="dxa" w:w="3402"/>
+            <w:shd w:val="clear" w:color="auto" w:fill="F4F7FA"/>
+          </w:tcPr>
+          <w:p>
+            <w:pPr>
+              <w:spacing w:before="10" w:after="10"/>
+            </w:pPr>
+            <w:r>
+              <w:rPr>
+                <w:rFonts w:ascii="Calibri" w:hAnsi="Calibri"/>
+                <w:b w:val="0"/>
+                <w:sz w:val="19"/>
+              </w:rPr>
+              <w:t>Schedule Performance Index (SPI)</w:t>
+            </w:r>
+          </w:p>
+        </w:tc>
+        <w:tc>
+          <w:tcPr>
+            <w:tcW w:type="dxa" w:w="2608"/>
+            <w:shd w:val="clear" w:color="auto" w:fill="F4F7FA"/>
+          </w:tcPr>
+          <w:p>
+            <w:pPr>
+              <w:spacing w:before="10" w:after="10"/>
+            </w:pPr>
+            <w:r>
+              <w:rPr>
+                <w:rFonts w:ascii="Calibri" w:hAnsi="Calibri"/>
+                <w:b w:val="0"/>
+                <w:sz w:val="19"/>
+              </w:rPr>
+              <w:t>≈ 0.80</w:t>
+            </w:r>
+          </w:p>
+        </w:tc>
+        <w:tc>
+          <w:tcPr>
+            <w:tcW w:type="dxa" w:w="4536"/>
+            <w:shd w:val="clear" w:color="auto" w:fill="F4F7FA"/>
+          </w:tcPr>
+          <w:p>
+            <w:pPr>
+              <w:spacing w:before="10" w:after="10"/>
+            </w:pPr>
+            <w:r>
+              <w:rPr>
+                <w:rFonts w:ascii="Calibri" w:hAnsi="Calibri"/>
+                <w:b w:val="0"/>
+                <w:sz w:val="19"/>
+              </w:rPr>
+              <w:t>−20% against plan</w:t>
+            </w:r>
+          </w:p>
+        </w:tc>
+        <w:tc>
+          <w:tcPr>
+            <w:tcW w:type="dxa" w:w="3061"/>
+            <w:shd w:val="clear" w:color="auto" w:fill="F4F7FA"/>
+          </w:tcPr>
+          <w:p>
+            <w:pPr>
+              <w:spacing w:before="10" w:after="10"/>
+            </w:pPr>
+            <w:r>
+              <w:rPr>
+                <w:rFonts w:ascii="Calibri" w:hAnsi="Calibri"/>
+                <w:b/>
+                <w:color w:val="C0392B"/>
+                <w:sz w:val="19"/>
+              </w:rPr>
+              <w:t>RED</w:t>
+            </w:r>
+          </w:p>
+        </w:tc>
+      </w:tr>
+      <w:tr>
+        <w:tc>
+          <w:tcPr>
+            <w:tcW w:type="dxa" w:w="3402"/>
+          </w:tcPr>
+          <w:p>
+            <w:pPr>
+              <w:spacing w:before="10" w:after="10"/>
+            </w:pPr>
+            <w:r>
+              <w:rPr>
+                <w:rFonts w:ascii="Calibri" w:hAnsi="Calibri"/>
+                <w:b w:val="0"/>
+                <w:sz w:val="19"/>
+              </w:rPr>
+              <w:t>Critical-path status</w:t>
+            </w:r>
+          </w:p>
+        </w:tc>
+        <w:tc>
+          <w:tcPr>
+            <w:tcW w:type="dxa" w:w="2608"/>
+          </w:tcPr>
+          <w:p>
+            <w:pPr>
+              <w:spacing w:before="10" w:after="10"/>
+            </w:pPr>
+            <w:r>
+              <w:rPr>
+                <w:rFonts w:ascii="Calibri" w:hAnsi="Calibri"/>
+                <w:b w:val="0"/>
+                <w:sz w:val="19"/>
+              </w:rPr>
+              <w:t>D1/D2 partial, D3 slipping</w:t>
+            </w:r>
+          </w:p>
+        </w:tc>
+        <w:tc>
+          <w:tcPr>
+            <w:tcW w:type="dxa" w:w="4536"/>
+          </w:tcPr>
+          <w:p>
+            <w:pPr>
+              <w:spacing w:before="10" w:after="10"/>
+            </w:pPr>
+            <w:r>
+              <w:rPr>
+                <w:rFonts w:ascii="Calibri" w:hAnsi="Calibri"/>
+                <w:b w:val="0"/>
+                <w:sz w:val="19"/>
+              </w:rPr>
+              <w:t>~10% slip on heavy activities</w:t>
+            </w:r>
+          </w:p>
+        </w:tc>
+        <w:tc>
+          <w:tcPr>
+            <w:tcW w:type="dxa" w:w="3061"/>
+          </w:tcPr>
+          <w:p>
+            <w:pPr>
+              <w:spacing w:before="10" w:after="10"/>
+            </w:pPr>
+            <w:r>
+              <w:rPr>
+                <w:rFonts w:ascii="Calibri" w:hAnsi="Calibri"/>
+                <w:b/>
+                <w:color w:val="C0392B"/>
+                <w:sz w:val="19"/>
+              </w:rPr>
+              <w:t>RED</w:t>
             </w:r>
           </w:p>
         </w:tc>
@@ -1140,7 +1625,8 @@
             <w:r>
               <w:rPr>
                 <w:rFonts w:ascii="Calibri" w:hAnsi="Calibri"/>
-                <w:b w:val="0"/>
+                <w:b/>
+                <w:color w:val="1E7A4F"/>
                 <w:sz w:val="19"/>
               </w:rPr>
               <w:t>OK</w:t>
@@ -1218,7 +1704,8 @@
             <w:r>
               <w:rPr>
                 <w:rFonts w:ascii="Calibri" w:hAnsi="Calibri"/>
-                <w:b w:val="0"/>
+                <w:b/>
+                <w:color w:val="C0392B"/>
                 <w:sz w:val="19"/>
               </w:rPr>
               <w:t>RED</w:t>
@@ -1292,7 +1779,8 @@
             <w:r>
               <w:rPr>
                 <w:rFonts w:ascii="Calibri" w:hAnsi="Calibri"/>
-                <w:b w:val="0"/>
+                <w:b/>
+                <w:color w:val="C0392B"/>
                 <w:sz w:val="19"/>
               </w:rPr>
               <w:t>RED</w:t>
@@ -1370,7 +1858,8 @@
             <w:r>
               <w:rPr>
                 <w:rFonts w:ascii="Calibri" w:hAnsi="Calibri"/>
-                <w:b w:val="0"/>
+                <w:b/>
+                <w:color w:val="C0392B"/>
                 <w:sz w:val="19"/>
               </w:rPr>
               <w:t>RED</w:t>
@@ -1444,7 +1933,8 @@
             <w:r>
               <w:rPr>
                 <w:rFonts w:ascii="Calibri" w:hAnsi="Calibri"/>
-                <w:b w:val="0"/>
+                <w:b/>
+                <w:color w:val="B8860B"/>
                 <w:sz w:val="19"/>
               </w:rPr>
               <w:t>AMBER</w:t>

</xml_diff>

<commit_message>
Standardise status labels to Green / Amber / Red and prevent wrapping
- HTML + DOCX: replace the "OK" green-status label with a proper
  "Green" badge (badge green), so all three RAG indicators read
  Green / Amber / Red consistently (no more "OK")
- Add white-space:nowrap for the RAG status badges so single-word
  statuses never wrap mid-word (no more "Re\n d"/"Gre\n en"/"Ambe\n r")
- Applied in the Status Report progress/schedule/cost tables and the
  disciplined DOCX status cells
- Validators green

Co-authored-by: CommandCodeBot <noreply@commandcode.ai>
</commit_message>
<xml_diff>
--- a/10 - Pole Trust Bank - Project Health and Status Report.docx
+++ b/10 - Pole Trust Bank - Project Health and Status Report.docx
@@ -567,7 +567,7 @@
                 <w:color w:val="1E7A4F"/>
                 <w:sz w:val="19"/>
               </w:rPr>
-              <w:t>OK</w:t>
+              <w:t>Green</w:t>
             </w:r>
           </w:p>
         </w:tc>
@@ -665,7 +665,7 @@
                 <w:color w:val="1E7A4F"/>
                 <w:sz w:val="19"/>
               </w:rPr>
-              <w:t>OK</w:t>
+              <w:t>Green</w:t>
             </w:r>
           </w:p>
         </w:tc>
@@ -1121,7 +1121,7 @@
                 <w:color w:val="1E7A4F"/>
                 <w:sz w:val="19"/>
               </w:rPr>
-              <w:t>OK</w:t>
+              <w:t>Green</w:t>
             </w:r>
           </w:p>
         </w:tc>
@@ -1200,7 +1200,7 @@
                 <w:color w:val="1E7A4F"/>
                 <w:sz w:val="19"/>
               </w:rPr>
-              <w:t>OK</w:t>
+              <w:t>Green</w:t>
             </w:r>
           </w:p>
         </w:tc>
@@ -1629,7 +1629,7 @@
                 <w:color w:val="1E7A4F"/>
                 <w:sz w:val="19"/>
               </w:rPr>
-              <w:t>OK</w:t>
+              <w:t>Green</w:t>
             </w:r>
           </w:p>
         </w:tc>

</xml_diff>